<commit_message>
Inculcated Python Visualization idea
</commit_message>
<xml_diff>
--- a/E-COMMERCE PROJECT REPORT.docx
+++ b/E-COMMERCE PROJECT REPORT.docx
@@ -175,10 +175,19 @@
         <w:t xml:space="preserve"> </w:t>
       </w:r>
       <w:r>
-        <w:t>Still working on it</w:t>
-      </w:r>
-      <w:r>
-        <w:t xml:space="preserve"> to get a precise value for each month…</w:t>
+        <w:t xml:space="preserve">Plan on using python </w:t>
+      </w:r>
+      <w:r>
+        <w:t>to calculate and visuali</w:t>
+      </w:r>
+      <w:r>
+        <w:t>ze</w:t>
+      </w:r>
+      <w:r>
+        <w:t xml:space="preserve"> the profit and loss status per month as opposed</w:t>
+      </w:r>
+      <w:r>
+        <w:t xml:space="preserve"> the cumbersome analytics done in Power BI</w:t>
       </w:r>
     </w:p>
     <w:sectPr>

</xml_diff>